<commit_message>
commit alchemer export fix.
</commit_message>
<xml_diff>
--- a/Turas launcher.docx
+++ b/Turas launcher.docx
@@ -109,7 +109,21 @@
         <w:rPr>
           <w:lang w:val="en-US"/>
         </w:rPr>
-        <w:t>if (!("</w:t>
+        <w:t xml:space="preserve">if </w:t>
+      </w:r>
+      <w:proofErr w:type="gramStart"/>
+      <w:r>
+        <w:rPr>
+          <w:lang w:val="en-US"/>
+        </w:rPr>
+        <w:t>(!(</w:t>
+      </w:r>
+      <w:proofErr w:type="gramEnd"/>
+      <w:r>
+        <w:rPr>
+          <w:lang w:val="en-US"/>
+        </w:rPr>
+        <w:t>"</w:t>
       </w:r>
       <w:proofErr w:type="spellStart"/>
       <w:r>
@@ -177,40 +191,6 @@
         </w:rPr>
         <w:t>")</w:t>
       </w:r>
-    </w:p>
-    <w:p>
-      <w:pPr>
-        <w:rPr>
-          <w:lang w:val="en-US"/>
-        </w:rPr>
-      </w:pPr>
-    </w:p>
-    <w:p>
-      <w:pPr>
-        <w:rPr>
-          <w:lang w:val="en-US"/>
-        </w:rPr>
-      </w:pPr>
-      <w:r>
-        <w:rPr>
-          <w:lang w:val="en-US"/>
-        </w:rPr>
-        <w:t>This launches Turas.</w:t>
-      </w:r>
-    </w:p>
-    <w:p>
-      <w:pPr>
-        <w:rPr>
-          <w:lang w:val="en-US"/>
-        </w:rPr>
-      </w:pPr>
-    </w:p>
-    <w:p>
-      <w:pPr>
-        <w:rPr>
-          <w:lang w:val="en-US"/>
-        </w:rPr>
-      </w:pPr>
     </w:p>
     <w:p>
       <w:pPr>
@@ -240,7 +220,6 @@
           <w:lang w:val="en-GB"/>
         </w:rPr>
       </w:pPr>
-      <w:proofErr w:type="spellStart"/>
       <w:r>
         <w:rPr>
           <w:rFonts w:ascii="Menlo" w:hAnsi="Menlo" w:cs="Menlo"/>
@@ -250,58 +229,6 @@
           <w:szCs w:val="22"/>
           <w:lang w:val="en-GB"/>
         </w:rPr>
-        <w:t>setwd</w:t>
-      </w:r>
-      <w:proofErr w:type="spellEnd"/>
-      <w:r>
-        <w:rPr>
-          <w:rFonts w:ascii="Menlo" w:hAnsi="Menlo" w:cs="Menlo"/>
-          <w:color w:val="000000"/>
-          <w:kern w:val="0"/>
-          <w:sz w:val="22"/>
-          <w:szCs w:val="22"/>
-          <w:lang w:val="en-GB"/>
-        </w:rPr>
-        <w:t>("~/Dev/Turas")</w:t>
-      </w:r>
-    </w:p>
-    <w:p>
-      <w:pPr>
-        <w:tabs>
-          <w:tab w:val="left" w:pos="560"/>
-          <w:tab w:val="left" w:pos="1120"/>
-          <w:tab w:val="left" w:pos="1680"/>
-          <w:tab w:val="left" w:pos="2240"/>
-          <w:tab w:val="left" w:pos="2800"/>
-          <w:tab w:val="left" w:pos="3360"/>
-          <w:tab w:val="left" w:pos="3920"/>
-          <w:tab w:val="left" w:pos="4480"/>
-          <w:tab w:val="left" w:pos="5040"/>
-          <w:tab w:val="left" w:pos="5600"/>
-          <w:tab w:val="left" w:pos="6160"/>
-          <w:tab w:val="left" w:pos="6720"/>
-        </w:tabs>
-        <w:autoSpaceDE w:val="0"/>
-        <w:autoSpaceDN w:val="0"/>
-        <w:adjustRightInd w:val="0"/>
-        <w:rPr>
-          <w:rFonts w:ascii="Menlo" w:hAnsi="Menlo" w:cs="Menlo"/>
-          <w:color w:val="000000"/>
-          <w:kern w:val="0"/>
-          <w:sz w:val="22"/>
-          <w:szCs w:val="22"/>
-          <w:lang w:val="en-GB"/>
-        </w:rPr>
-      </w:pPr>
-      <w:r>
-        <w:rPr>
-          <w:rFonts w:ascii="Menlo" w:hAnsi="Menlo" w:cs="Menlo"/>
-          <w:color w:val="000000"/>
-          <w:kern w:val="0"/>
-          <w:sz w:val="22"/>
-          <w:szCs w:val="22"/>
-          <w:lang w:val="en-GB"/>
-        </w:rPr>
         <w:t>source(</w:t>
       </w:r>
       <w:r>
@@ -325,22 +252,9 @@
           <w:szCs w:val="22"/>
           <w:lang w:val="en-GB"/>
         </w:rPr>
-        <w:t>launch_</w:t>
-      </w:r>
-      <w:proofErr w:type="gramStart"/>
-      <w:r>
-        <w:rPr>
-          <w:rFonts w:ascii="Menlo" w:hAnsi="Menlo" w:cs="Menlo"/>
-          <w:color w:val="B42419"/>
-          <w:kern w:val="0"/>
-          <w:sz w:val="22"/>
-          <w:szCs w:val="22"/>
-          <w:lang w:val="en-GB"/>
-        </w:rPr>
-        <w:t>turas.R</w:t>
+        <w:t>launch_turas.R</w:t>
       </w:r>
       <w:proofErr w:type="spellEnd"/>
-      <w:proofErr w:type="gramEnd"/>
       <w:r>
         <w:rPr>
           <w:rFonts w:ascii="Menlo" w:hAnsi="Menlo" w:cs="Menlo"/>

</xml_diff>